<commit_message>
Add APV2 long technical report release package
</commit_message>
<xml_diff>
--- a/paper_artifacts/release_20260614/APV2_仓库发布说明_20260614.docx
+++ b/paper_artifacts/release_20260614/APV2_仓库发布说明_20260614.docx
@@ -85,7 +85,7 @@
           <w:rFonts w:ascii="Consolas" w:hAnsi="Consolas" w:eastAsia="Consolas"/>
           <w:sz w:val="21"/>
         </w:rPr>
-        <w:t>apv2-release-20260614-final-cn-pdf</w:t>
+        <w:t>apv2-release-20260614-final-longreport</w:t>
       </w:r>
     </w:p>
     <w:tbl>
@@ -455,7 +455,53 @@
                 <w:rFonts w:ascii="Microsoft YaHei" w:hAnsi="Microsoft YaHei" w:eastAsia="Microsoft YaHei"/>
                 <w:sz w:val="18"/>
               </w:rPr>
-              <w:t>发布版论文稿</w:t>
+              <w:t>发布版短主文</w:t>
+            </w:r>
+          </w:p>
+        </w:tc>
+      </w:tr>
+      <w:tr>
+        <w:tc>
+          <w:tcPr>
+            <w:tcW w:type="dxa" w:w="4997"/>
+          </w:tcPr>
+          <w:p>
+            <w:r/>
+            <w:r>
+              <w:rPr>
+                <w:rFonts w:ascii="Consolas" w:hAnsi="Consolas" w:eastAsia="Consolas"/>
+                <w:sz w:val="18"/>
+              </w:rPr>
+              <w:t>APV2_长篇技术报告_完整论证与实验附录_20260614.docx</w:t>
+            </w:r>
+            <w:r>
+              <w:rPr>
+                <w:rFonts w:ascii="Microsoft YaHei" w:hAnsi="Microsoft YaHei" w:eastAsia="Microsoft YaHei"/>
+                <w:sz w:val="18"/>
+              </w:rPr>
+              <w:t xml:space="preserve"> / </w:t>
+            </w:r>
+            <w:r>
+              <w:rPr>
+                <w:rFonts w:ascii="Consolas" w:hAnsi="Consolas" w:eastAsia="Consolas"/>
+                <w:sz w:val="18"/>
+              </w:rPr>
+              <w:t>.pdf</w:t>
+            </w:r>
+          </w:p>
+        </w:tc>
+        <w:tc>
+          <w:tcPr>
+            <w:tcW w:type="dxa" w:w="4997"/>
+          </w:tcPr>
+          <w:p>
+            <w:r/>
+            <w:r>
+              <w:rPr>
+                <w:rFonts w:ascii="Microsoft YaHei" w:hAnsi="Microsoft YaHei" w:eastAsia="Microsoft YaHei"/>
+                <w:sz w:val="18"/>
+              </w:rPr>
+              <w:t>完整理论、机制、公式、trace、实验附录与审稿疑问回应</w:t>
             </w:r>
           </w:p>
         </w:tc>

</xml_diff>